<commit_message>
Refine report layout and bump version to 2.1
</commit_message>
<xml_diff>
--- a/data/2025/outputs/Race 1 -- race report.docx
+++ b/data/2025/outputs/Race 1 -- race report.docx
@@ -5659,16 +5659,69 @@
   <w:p>
     <w:pPr>
       <w:pStyle w:val="Footer"/>
-      <w:jc w:val="center"/>
     </w:pPr>
-    <w:r>
-      <w:rPr>
-        <w:color w:val="808090"/>
-        <w:sz w:val="16"/>
-      </w:rPr>
-      <w:t>© 2025 Wiltshire Road and Running League  |  Generated automatically</w:t>
-    </w:r>
   </w:p>
+  <w:tbl>
+    <w:tblPr>
+      <w:tblW w:type="auto" w:w="0"/>
+      <w:tblLook w:firstColumn="1" w:firstRow="1" w:lastColumn="0" w:lastRow="0" w:noHBand="0" w:noVBand="1" w:val="04A0"/>
+      <w:tblBorders>
+        <w:top w:val="none" w:sz="0" w:space="0" w:color="auto"/>
+        <w:left w:val="none" w:sz="0" w:space="0" w:color="auto"/>
+        <w:bottom w:val="none" w:sz="0" w:space="0" w:color="auto"/>
+        <w:right w:val="none" w:sz="0" w:space="0" w:color="auto"/>
+        <w:insideH w:val="none" w:sz="0" w:space="0" w:color="auto"/>
+        <w:insideV w:val="none" w:sz="0" w:space="0" w:color="auto"/>
+      </w:tblBorders>
+    </w:tblPr>
+    <w:tblGrid>
+      <w:gridCol w:w="3402"/>
+      <w:gridCol w:w="3402"/>
+      <w:gridCol w:w="3402"/>
+    </w:tblGrid>
+    <w:tr>
+      <w:tc>
+        <w:tcPr>
+          <w:tcW w:type="dxa" w:w="3402"/>
+        </w:tcPr>
+        <w:p>
+          <w:pPr>
+            <w:jc w:val="left"/>
+          </w:pPr>
+          <w:r>
+            <w:rPr>
+              <w:color w:val="808090"/>
+              <w:sz w:val="16"/>
+            </w:rPr>
+            <w:t>© 2025 Wiltshire Athletics Assoc.</w:t>
+          </w:r>
+        </w:p>
+      </w:tc>
+      <w:tc>
+        <w:tcPr>
+          <w:tcW w:type="dxa" w:w="3969"/>
+        </w:tcPr>
+        <w:p>
+          <w:pPr>
+            <w:jc w:val="center"/>
+          </w:pPr>
+          <w:r>
+            <w:rPr>
+              <w:color w:val="808090"/>
+              <w:sz w:val="16"/>
+            </w:rPr>
+            <w:t>Wiltshire League Scorer v1.4</w:t>
+          </w:r>
+        </w:p>
+      </w:tc>
+      <w:tc>
+        <w:tcPr>
+          <w:tcW w:type="dxa" w:w="2835"/>
+        </w:tcPr>
+        <w:p/>
+      </w:tc>
+    </w:tr>
+  </w:tbl>
 </w:ftr>
 </file>
 

</xml_diff>